<commit_message>
Expand Chapter 1 companion; add neuromodulator reference table to Chapter 3 companion
- Chapter 1 Student Notes and Labs: replaces the 2-page outline with full notes on
  each section of the chapter and five labs (brains vs computers comparison,
  history-dependent learning with no reset, noise and redundancy with dice,
  viability vs truth under asymmetric cost, engineering autopsy and AI reflection)
- Chapter 3 Student Notes: reference table of the four neuromodulatory systems
  (source nuclei, targets, context signaled, timescale); Lab 3.5 now points to it
- memory-bank: progress and active context updated

Co-Authored-By: Claude Fable 5.1 <noreply@anthropic.com>
</commit_message>
<xml_diff>
--- a/docs/companion/Chapter3/Word/How_the_Brain_Learns_Chapter_3_Student_Notes_and_Labs.docx
+++ b/docs/companion/Chapter3/Word/How_the_Brain_Learns_Chapter_3_Student_Notes_and_Labs.docx
@@ -2,7 +2,7 @@
 <file path=word/document.xml><?xml version="1.0" encoding="utf-8"?>
 <w:document xmlns:w="http://schemas.openxmlformats.org/wordprocessingml/2006/main" xmlns:m="http://schemas.openxmlformats.org/officeDocument/2006/math" xmlns:r="http://schemas.openxmlformats.org/officeDocument/2006/relationships" xmlns:o="urn:schemas-microsoft-com:office:office" xmlns:v="urn:schemas-microsoft-com:vml" xmlns:w10="urn:schemas-microsoft-com:office:word" xmlns:a="http://schemas.openxmlformats.org/drawingml/2006/main" xmlns:pic="http://schemas.openxmlformats.org/drawingml/2006/picture" xmlns:wp="http://schemas.openxmlformats.org/drawingml/2006/wordprocessingDrawing">
   <w:body>
-    <w:bookmarkStart w:id="63" w:name="chapter-3---student-notes-and-labs"/>
+    <w:bookmarkStart w:id="64" w:name="chapter-3---student-notes-and-labs"/>
     <w:p>
       <w:pPr>
         <w:pStyle w:val="Heading1"/>
@@ -19,7 +19,7 @@
         <w:t xml:space="preserve">Neuromodulation: How Chemical Context Shapes Learning and Behavior</w:t>
       </w:r>
     </w:p>
-    <w:bookmarkStart w:id="34" w:name="student-notes"/>
+    <w:bookmarkStart w:id="35" w:name="student-notes"/>
     <w:p>
       <w:pPr>
         <w:pStyle w:val="Heading2"/>
@@ -679,12 +679,384 @@
       </w:r>
     </w:p>
     <w:bookmarkEnd w:id="29"/>
-    <w:bookmarkStart w:id="30" w:name="what-physically-changes"/>
+    <w:bookmarkStart w:id="30" w:name="X594b1e971054aa882ee83058dacb1028c7d5616"/>
     <w:p>
       <w:pPr>
         <w:pStyle w:val="Heading3"/>
       </w:pPr>
       <w:r>
+        <w:t xml:space="preserve">Reference: the four major neuromodulatory systems</w:t>
+      </w:r>
+    </w:p>
+    <w:p>
+      <w:pPr>
+        <w:pStyle w:val="FirstParagraph"/>
+      </w:pPr>
+      <w:r>
+        <w:t xml:space="preserve">The chapter names the systems by their chemistry and their role but not by their anatomy. Use this table for Lab 3.5 and as a lookup when later chapters refer to a nucleus by name.</w:t>
+      </w:r>
+    </w:p>
+    <w:tbl>
+      <w:tblPr>
+        <w:tblStyle w:val="Table"/>
+        <w:tblW w:type="pct" w:w="5000"/>
+        <w:tblLook w:firstRow="1" w:lastRow="0" w:firstColumn="0" w:lastColumn="0" w:noHBand="0" w:noVBand="0" w:val="0020"/>
+        <w:jc w:val="start"/>
+      </w:tblPr>
+      <w:tblGrid>
+        <w:gridCol w:w="1584"/>
+        <w:gridCol w:w="1584"/>
+        <w:gridCol w:w="1584"/>
+        <w:gridCol w:w="1584"/>
+        <w:gridCol w:w="1584"/>
+      </w:tblGrid>
+      <w:tr>
+        <w:trPr>
+          <w:tblHeader w:val="true"/>
+        </w:trPr>
+        <w:tc>
+          <w:tcPr/>
+          <w:p>
+            <w:pPr>
+              <w:pStyle w:val="Compact"/>
+              <w:jc w:val="left"/>
+            </w:pPr>
+            <w:r>
+              <w:t xml:space="preserve">System</w:t>
+            </w:r>
+          </w:p>
+        </w:tc>
+        <w:tc>
+          <w:tcPr/>
+          <w:p>
+            <w:pPr>
+              <w:pStyle w:val="Compact"/>
+              <w:jc w:val="left"/>
+            </w:pPr>
+            <w:r>
+              <w:t xml:space="preserve">Source nuclei (location)</w:t>
+            </w:r>
+          </w:p>
+        </w:tc>
+        <w:tc>
+          <w:tcPr/>
+          <w:p>
+            <w:pPr>
+              <w:pStyle w:val="Compact"/>
+              <w:jc w:val="left"/>
+            </w:pPr>
+            <w:r>
+              <w:t xml:space="preserve">Main targets</w:t>
+            </w:r>
+          </w:p>
+        </w:tc>
+        <w:tc>
+          <w:tcPr/>
+          <w:p>
+            <w:pPr>
+              <w:pStyle w:val="Compact"/>
+              <w:jc w:val="left"/>
+            </w:pPr>
+            <w:r>
+              <w:t xml:space="preserve">Context it signals</w:t>
+            </w:r>
+          </w:p>
+        </w:tc>
+        <w:tc>
+          <w:tcPr/>
+          <w:p>
+            <w:pPr>
+              <w:pStyle w:val="Compact"/>
+              <w:jc w:val="left"/>
+            </w:pPr>
+            <w:r>
+              <w:t xml:space="preserve">Typical timescale</w:t>
+            </w:r>
+          </w:p>
+        </w:tc>
+      </w:tr>
+      <w:tr>
+        <w:tc>
+          <w:tcPr/>
+          <w:p>
+            <w:pPr>
+              <w:pStyle w:val="Compact"/>
+              <w:jc w:val="left"/>
+            </w:pPr>
+            <w:r>
+              <w:t xml:space="preserve">Dopamine (dopaminergic)</w:t>
+            </w:r>
+          </w:p>
+        </w:tc>
+        <w:tc>
+          <w:tcPr/>
+          <w:p>
+            <w:pPr>
+              <w:pStyle w:val="Compact"/>
+              <w:jc w:val="left"/>
+            </w:pPr>
+            <w:r>
+              <w:t xml:space="preserve">Ventral tegmental area and substantia nigra pars compacta (midbrain)</w:t>
+            </w:r>
+          </w:p>
+        </w:tc>
+        <w:tc>
+          <w:tcPr/>
+          <w:p>
+            <w:pPr>
+              <w:pStyle w:val="Compact"/>
+              <w:jc w:val="left"/>
+            </w:pPr>
+            <w:r>
+              <w:t xml:space="preserve">Striatum, nucleus accumbens, prefrontal cortex</w:t>
+            </w:r>
+          </w:p>
+        </w:tc>
+        <w:tc>
+          <w:tcPr/>
+          <w:p>
+            <w:pPr>
+              <w:pStyle w:val="Compact"/>
+              <w:jc w:val="left"/>
+            </w:pPr>
+            <w:r>
+              <w:t xml:space="preserve">Reward prediction error; salience of unexpected events</w:t>
+            </w:r>
+          </w:p>
+        </w:tc>
+        <w:tc>
+          <w:tcPr/>
+          <w:p>
+            <w:pPr>
+              <w:pStyle w:val="Compact"/>
+              <w:jc w:val="left"/>
+            </w:pPr>
+            <w:r>
+              <w:t xml:space="preserve">Phasic bursts and dips of about 100 ms to 1 s on a slowly varying tonic level</w:t>
+            </w:r>
+          </w:p>
+        </w:tc>
+      </w:tr>
+      <w:tr>
+        <w:tc>
+          <w:tcPr/>
+          <w:p>
+            <w:pPr>
+              <w:pStyle w:val="Compact"/>
+              <w:jc w:val="left"/>
+            </w:pPr>
+            <w:r>
+              <w:t xml:space="preserve">Norepinephrine (noradrenergic)</w:t>
+            </w:r>
+          </w:p>
+        </w:tc>
+        <w:tc>
+          <w:tcPr/>
+          <w:p>
+            <w:pPr>
+              <w:pStyle w:val="Compact"/>
+              <w:jc w:val="left"/>
+            </w:pPr>
+            <w:r>
+              <w:t xml:space="preserve">Locus coeruleus (pons)</w:t>
+            </w:r>
+          </w:p>
+        </w:tc>
+        <w:tc>
+          <w:tcPr/>
+          <w:p>
+            <w:pPr>
+              <w:pStyle w:val="Compact"/>
+              <w:jc w:val="left"/>
+            </w:pPr>
+            <w:r>
+              <w:t xml:space="preserve">Almost the entire cortex, hippocampus, thalamus, cerebellum</w:t>
+            </w:r>
+          </w:p>
+        </w:tc>
+        <w:tc>
+          <w:tcPr/>
+          <w:p>
+            <w:pPr>
+              <w:pStyle w:val="Compact"/>
+              <w:jc w:val="left"/>
+            </w:pPr>
+            <w:r>
+              <w:t xml:space="preserve">Arousal, surprise, uncertainty; a signal to reset or re-engage networks</w:t>
+            </w:r>
+          </w:p>
+        </w:tc>
+        <w:tc>
+          <w:tcPr/>
+          <w:p>
+            <w:pPr>
+              <w:pStyle w:val="Compact"/>
+              <w:jc w:val="left"/>
+            </w:pPr>
+            <w:r>
+              <w:t xml:space="preserve">Phasic responses of hundreds of ms; tonic level shifts over minutes</w:t>
+            </w:r>
+          </w:p>
+        </w:tc>
+      </w:tr>
+      <w:tr>
+        <w:tc>
+          <w:tcPr/>
+          <w:p>
+            <w:pPr>
+              <w:pStyle w:val="Compact"/>
+              <w:jc w:val="left"/>
+            </w:pPr>
+            <w:r>
+              <w:t xml:space="preserve">Serotonin (serotonergic)</w:t>
+            </w:r>
+          </w:p>
+        </w:tc>
+        <w:tc>
+          <w:tcPr/>
+          <w:p>
+            <w:pPr>
+              <w:pStyle w:val="Compact"/>
+              <w:jc w:val="left"/>
+            </w:pPr>
+            <w:r>
+              <w:t xml:space="preserve">Raphe nuclei, chiefly the dorsal and median raphe (brainstem)</w:t>
+            </w:r>
+          </w:p>
+        </w:tc>
+        <w:tc>
+          <w:tcPr/>
+          <w:p>
+            <w:pPr>
+              <w:pStyle w:val="Compact"/>
+              <w:jc w:val="left"/>
+            </w:pPr>
+            <w:r>
+              <w:t xml:space="preserve">Widespread cortex, hippocampus, striatum, amygdala</w:t>
+            </w:r>
+          </w:p>
+        </w:tc>
+        <w:tc>
+          <w:tcPr/>
+          <w:p>
+            <w:pPr>
+              <w:pStyle w:val="Compact"/>
+              <w:jc w:val="left"/>
+            </w:pPr>
+            <w:r>
+              <w:t xml:space="preserve">Patience and waiting, mood and stability, damping of impulsive responses</w:t>
+            </w:r>
+          </w:p>
+        </w:tc>
+        <w:tc>
+          <w:tcPr/>
+          <w:p>
+            <w:pPr>
+              <w:pStyle w:val="Compact"/>
+              <w:jc w:val="left"/>
+            </w:pPr>
+            <w:r>
+              <w:t xml:space="preserve">Seconds to minutes; among the slowest modulatory signals</w:t>
+            </w:r>
+          </w:p>
+        </w:tc>
+      </w:tr>
+      <w:tr>
+        <w:tc>
+          <w:tcPr/>
+          <w:p>
+            <w:pPr>
+              <w:pStyle w:val="Compact"/>
+              <w:jc w:val="left"/>
+            </w:pPr>
+            <w:r>
+              <w:t xml:space="preserve">Acetylcholine (cholinergic)</w:t>
+            </w:r>
+          </w:p>
+        </w:tc>
+        <w:tc>
+          <w:tcPr/>
+          <w:p>
+            <w:pPr>
+              <w:pStyle w:val="Compact"/>
+              <w:jc w:val="left"/>
+            </w:pPr>
+            <w:r>
+              <w:t xml:space="preserve">Basal forebrain (nucleus basalis of Meynert, medial septum) for cortex and hippocampus; pedunculopontine and laterodorsal tegmental nuclei for thalamus and brainstem</w:t>
+            </w:r>
+          </w:p>
+        </w:tc>
+        <w:tc>
+          <w:tcPr/>
+          <w:p>
+            <w:pPr>
+              <w:pStyle w:val="Compact"/>
+              <w:jc w:val="left"/>
+            </w:pPr>
+            <w:r>
+              <w:t xml:space="preserve">Cortex, hippocampus, thalamus</w:t>
+            </w:r>
+          </w:p>
+        </w:tc>
+        <w:tc>
+          <w:tcPr/>
+          <w:p>
+            <w:pPr>
+              <w:pStyle w:val="Compact"/>
+              <w:jc w:val="left"/>
+            </w:pPr>
+            <w:r>
+              <w:t xml:space="preserve">Attention and expected uncertainty; the balance between encoding new information and retrieving stored information</w:t>
+            </w:r>
+          </w:p>
+        </w:tc>
+        <w:tc>
+          <w:tcPr/>
+          <w:p>
+            <w:pPr>
+              <w:pStyle w:val="Compact"/>
+              <w:jc w:val="left"/>
+            </w:pPr>
+            <w:r>
+              <w:t xml:space="preserve">Seconds, with faster local release in cortex</w:t>
+            </w:r>
+          </w:p>
+        </w:tc>
+      </w:tr>
+    </w:tbl>
+    <w:p>
+      <w:pPr>
+        <w:pStyle w:val="BodyText"/>
+      </w:pPr>
+      <w:r>
+        <w:t xml:space="preserve">Two cautions. First, every one of these chemicals is also used in fast, point-to-point synapses somewhere in the nervous system; the table describes their modulatory role, which is the chapter’s subject. Second, the</w:t>
+      </w:r>
+      <w:r>
+        <w:t xml:space="preserve"> </w:t>
+      </w:r>
+      <w:r>
+        <w:t xml:space="preserve">“</w:t>
+      </w:r>
+      <w:r>
+        <w:t xml:space="preserve">context</w:t>
+      </w:r>
+      <w:r>
+        <w:t xml:space="preserve">”</w:t>
+      </w:r>
+      <w:r>
+        <w:t xml:space="preserve"> </w:t>
+      </w:r>
+      <w:r>
+        <w:t xml:space="preserve">column is a summary of current understanding, not a settled fact. Serotonin in particular has several proposed roles, and the chapter commits only to the broad framing of stability and damping.</w:t>
+      </w:r>
+    </w:p>
+    <w:bookmarkEnd w:id="30"/>
+    <w:bookmarkStart w:id="31" w:name="what-physically-changes"/>
+    <w:p>
+      <w:pPr>
+        <w:pStyle w:val="Heading3"/>
+      </w:pPr>
+      <w:r>
         <w:t xml:space="preserve">What physically changes</w:t>
       </w:r>
     </w:p>
@@ -714,8 +1086,8 @@
         <w:t xml:space="preserve">is a change in structure and in probability, carried forward because structure persists.</w:t>
       </w:r>
     </w:p>
-    <w:bookmarkEnd w:id="30"/>
-    <w:bookmarkStart w:id="31" w:name="X12a6666f2263f44c8b3ba68a6e2470f62dfa607"/>
+    <w:bookmarkEnd w:id="31"/>
+    <w:bookmarkStart w:id="32" w:name="X12a6666f2263f44c8b3ba68a6e2470f62dfa607"/>
     <w:p>
       <w:pPr>
         <w:pStyle w:val="Heading3"/>
@@ -740,8 +1112,8 @@
         <w:t xml:space="preserve">The clinical evidence supports it. Drugs, neuromodulatory disorders, and deep brain stimulation change learning and behavior dramatically without rewiring circuits, by changing the chemical context those circuits operate in.</w:t>
       </w:r>
     </w:p>
-    <w:bookmarkEnd w:id="31"/>
-    <w:bookmarkStart w:id="32" w:name="implications-for-artificial-intelligence"/>
+    <w:bookmarkEnd w:id="32"/>
+    <w:bookmarkStart w:id="33" w:name="implications-for-artificial-intelligence"/>
     <w:p>
       <w:pPr>
         <w:pStyle w:val="Heading3"/>
@@ -782,8 +1154,8 @@
         <w:t xml:space="preserve">4) The goal of biological learning is viability under uncertainty, not minimization of a loss. Success is defined operationally.</w:t>
       </w:r>
     </w:p>
-    <w:bookmarkEnd w:id="32"/>
-    <w:bookmarkStart w:id="33" w:name="practical-summary"/>
+    <w:bookmarkEnd w:id="33"/>
+    <w:bookmarkStart w:id="34" w:name="practical-summary"/>
     <w:p>
       <w:pPr>
         <w:pStyle w:val="Heading3"/>
@@ -876,9 +1248,9 @@
         <w:t xml:space="preserve">Plasticity is gated. Nothing changes unless context says it should.</w:t>
       </w:r>
     </w:p>
-    <w:bookmarkEnd w:id="33"/>
     <w:bookmarkEnd w:id="34"/>
-    <w:bookmarkStart w:id="62" w:name="labs"/>
+    <w:bookmarkEnd w:id="35"/>
+    <w:bookmarkStart w:id="63" w:name="labs"/>
     <w:p>
       <w:pPr>
         <w:pStyle w:val="Heading2"/>
@@ -887,7 +1259,7 @@
         <w:t xml:space="preserve">Labs</w:t>
       </w:r>
     </w:p>
-    <w:bookmarkStart w:id="36" w:name="lab-notes-how-to-succeed-in-these-labs"/>
+    <w:bookmarkStart w:id="37" w:name="lab-notes-how-to-succeed-in-these-labs"/>
     <w:p>
       <w:pPr>
         <w:pStyle w:val="Heading3"/>
@@ -930,7 +1302,7 @@
         <w:t xml:space="preserve">3) Finish every lab with an interpretation: what changes if the parameters change, and what does the biology gain or lose?</w:t>
       </w:r>
     </w:p>
-    <w:bookmarkStart w:id="35" w:name="what-to-hand-in-for-every-lab"/>
+    <w:bookmarkStart w:id="36" w:name="what-to-hand-in-for-every-lab"/>
     <w:p>
       <w:pPr>
         <w:pStyle w:val="Heading4"/>
@@ -975,9 +1347,9 @@
         <w:t xml:space="preserve">A short interpretation (6-12 sentences).</w:t>
       </w:r>
     </w:p>
-    <w:bookmarkEnd w:id="35"/>
     <w:bookmarkEnd w:id="36"/>
-    <w:bookmarkStart w:id="43" w:name="X4185b2907fc16d1278b7334c3d3d2bbbd4058c4"/>
+    <w:bookmarkEnd w:id="37"/>
+    <w:bookmarkStart w:id="44" w:name="X4185b2907fc16d1278b7334c3d3d2bbbd4058c4"/>
     <w:p>
       <w:pPr>
         <w:pStyle w:val="Heading3"/>
@@ -986,7 +1358,7 @@
         <w:t xml:space="preserve">Lab 3.1 - Reward Prediction Error by Hand (why dopamine moves to the cue)</w:t>
       </w:r>
     </w:p>
-    <w:bookmarkStart w:id="37" w:name="purpose"/>
+    <w:bookmarkStart w:id="38" w:name="purpose"/>
     <w:p>
       <w:pPr>
         <w:pStyle w:val="Heading4"/>
@@ -1003,8 +1375,8 @@
         <w:t xml:space="preserve">To reproduce, numerically, the two signature findings in Figures 5 and 6 of the chapter: the dopamine response to a reward shrinks as the reward becomes predictable, and the response reappears at the cue that predicts it.</w:t>
       </w:r>
     </w:p>
-    <w:bookmarkEnd w:id="37"/>
-    <w:bookmarkStart w:id="38" w:name="materials"/>
+    <w:bookmarkEnd w:id="38"/>
+    <w:bookmarkStart w:id="39" w:name="materials"/>
     <w:p>
       <w:pPr>
         <w:pStyle w:val="Heading4"/>
@@ -1021,8 +1393,8 @@
         <w:t xml:space="preserve">Notebook, pen or pencil, calculator (recommended).</w:t>
       </w:r>
     </w:p>
-    <w:bookmarkEnd w:id="38"/>
-    <w:bookmarkStart w:id="39" w:name="given-parameters-use-exactly-these"/>
+    <w:bookmarkEnd w:id="39"/>
+    <w:bookmarkStart w:id="40" w:name="given-parameters-use-exactly-these"/>
     <w:p>
       <w:pPr>
         <w:pStyle w:val="Heading4"/>
@@ -1069,8 +1441,8 @@
         <w:t xml:space="preserve">Treat the dopamine response at the reward as delta, and the dopamine response at the cue as V (the amount of reward the cue now predicts).</w:t>
       </w:r>
     </w:p>
-    <w:bookmarkEnd w:id="39"/>
-    <w:bookmarkStart w:id="40" w:name="setup-diagram-do-this-first"/>
+    <w:bookmarkEnd w:id="40"/>
+    <w:bookmarkStart w:id="41" w:name="setup-diagram-do-this-first"/>
     <w:p>
       <w:pPr>
         <w:pStyle w:val="Heading4"/>
@@ -1133,8 +1505,8 @@
         <w:t xml:space="preserve">”</w:t>
       </w:r>
     </w:p>
-    <w:bookmarkEnd w:id="40"/>
-    <w:bookmarkStart w:id="41" w:name="procedure-follow-in-order"/>
+    <w:bookmarkEnd w:id="41"/>
+    <w:bookmarkStart w:id="42" w:name="procedure-follow-in-order"/>
     <w:p>
       <w:pPr>
         <w:pStyle w:val="Heading4"/>
@@ -1251,8 +1623,8 @@
         <w:t xml:space="preserve">to dopamine, where did the signal go, and what does the omission dip tell the rest of the brain?</w:t>
       </w:r>
     </w:p>
-    <w:bookmarkEnd w:id="41"/>
-    <w:bookmarkStart w:id="42" w:name="what-to-record"/>
+    <w:bookmarkEnd w:id="42"/>
+    <w:bookmarkStart w:id="43" w:name="what-to-record"/>
     <w:p>
       <w:pPr>
         <w:pStyle w:val="Heading4"/>
@@ -1269,9 +1641,9 @@
         <w:t xml:space="preserve">Table for Parts A through C, the two-bar diagrams for trial 1 and trial 8, and your interpretation.</w:t>
       </w:r>
     </w:p>
-    <w:bookmarkEnd w:id="42"/>
     <w:bookmarkEnd w:id="43"/>
-    <w:bookmarkStart w:id="49" w:name="X1f03f93b0291c71b1ec95644323bacd53947c3b"/>
+    <w:bookmarkEnd w:id="44"/>
+    <w:bookmarkStart w:id="50" w:name="X1f03f93b0291c71b1ec95644323bacd53947c3b"/>
     <w:p>
       <w:pPr>
         <w:pStyle w:val="Heading3"/>
@@ -1280,7 +1652,7 @@
         <w:t xml:space="preserve">Lab 3.2 - Eligibility Traces and the Temporal Gap (three-factor rule)</w:t>
       </w:r>
     </w:p>
-    <w:bookmarkStart w:id="44" w:name="purpose-1"/>
+    <w:bookmarkStart w:id="45" w:name="purpose-1"/>
     <w:p>
       <w:pPr>
         <w:pStyle w:val="Heading4"/>
@@ -1297,8 +1669,8 @@
         <w:t xml:space="preserve">To see why a global, late-arriving signal can still produce synapse-specific learning, and what is lost when the delay between activity and outcome grows.</w:t>
       </w:r>
     </w:p>
-    <w:bookmarkEnd w:id="44"/>
-    <w:bookmarkStart w:id="45" w:name="given-parameters"/>
+    <w:bookmarkEnd w:id="45"/>
+    <w:bookmarkStart w:id="46" w:name="given-parameters"/>
     <w:p>
       <w:pPr>
         <w:pStyle w:val="Heading4"/>
@@ -1339,8 +1711,8 @@
         <w:t xml:space="preserve">Three-factor update at the moment dopamine arrives: delta_w = eta * e * delta.</w:t>
       </w:r>
     </w:p>
-    <w:bookmarkEnd w:id="45"/>
-    <w:bookmarkStart w:id="46" w:name="setup"/>
+    <w:bookmarkEnd w:id="46"/>
+    <w:bookmarkStart w:id="47" w:name="setup"/>
     <w:p>
       <w:pPr>
         <w:pStyle w:val="Heading4"/>
@@ -1373,8 +1745,8 @@
         <w:t xml:space="preserve">Draw a dopaminergic axon passing over all three (volume transmission: it cannot single any of them out).</w:t>
       </w:r>
     </w:p>
-    <w:bookmarkEnd w:id="46"/>
-    <w:bookmarkStart w:id="47" w:name="procedure"/>
+    <w:bookmarkEnd w:id="47"/>
+    <w:bookmarkStart w:id="48" w:name="procedure"/>
     <w:p>
       <w:pPr>
         <w:pStyle w:val="Heading4"/>
@@ -1475,8 +1847,8 @@
         <w:t xml:space="preserve">10) Write 8-12 sentences: what does the decay constant buy the organism, what does it cost, and why can the dopaminergic axon be so unselective without destroying specificity?</w:t>
       </w:r>
     </w:p>
-    <w:bookmarkEnd w:id="47"/>
-    <w:bookmarkStart w:id="48" w:name="X10d9b91b781dcb66802a72e57dff1b24da2f12a"/>
+    <w:bookmarkEnd w:id="48"/>
+    <w:bookmarkStart w:id="49" w:name="X10d9b91b781dcb66802a72e57dff1b24da2f12a"/>
     <w:p>
       <w:pPr>
         <w:pStyle w:val="Heading4"/>
@@ -1511,9 +1883,9 @@
         <w:t xml:space="preserve">to credit an action.</w:t>
       </w:r>
     </w:p>
-    <w:bookmarkEnd w:id="48"/>
     <w:bookmarkEnd w:id="49"/>
-    <w:bookmarkStart w:id="54" w:name="X3fabbc05e32614dabd3448655b1badc3f258cab"/>
+    <w:bookmarkEnd w:id="50"/>
+    <w:bookmarkStart w:id="55" w:name="X3fabbc05e32614dabd3448655b1badc3f258cab"/>
     <w:p>
       <w:pPr>
         <w:pStyle w:val="Heading3"/>
@@ -1522,7 +1894,7 @@
         <w:t xml:space="preserve">Lab 3.3 - Credit Assignment Under Uncertainty (a dice-driven learner)</w:t>
       </w:r>
     </w:p>
-    <w:bookmarkStart w:id="50" w:name="purpose-2"/>
+    <w:bookmarkStart w:id="51" w:name="purpose-2"/>
     <w:p>
       <w:pPr>
         <w:pStyle w:val="Heading4"/>
@@ -1539,8 +1911,8 @@
         <w:t xml:space="preserve">To experience credit assignment as the brain faces it: no labels, noisy outcomes, overlapping activity, and a single global signal that cannot name the responsible synapse.</w:t>
       </w:r>
     </w:p>
-    <w:bookmarkEnd w:id="50"/>
-    <w:bookmarkStart w:id="51" w:name="given-model"/>
+    <w:bookmarkEnd w:id="51"/>
+    <w:bookmarkStart w:id="52" w:name="given-model"/>
     <w:p>
       <w:pPr>
         <w:pStyle w:val="Heading4"/>
@@ -1599,8 +1971,8 @@
         <w:t xml:space="preserve">Three-factor update, applied to every synapse that was active on the trial: w = w + 0.1 * delta. Inactive synapses have no trace and do not change.</w:t>
       </w:r>
     </w:p>
-    <w:bookmarkEnd w:id="51"/>
-    <w:bookmarkStart w:id="52" w:name="procedure-1"/>
+    <w:bookmarkEnd w:id="52"/>
+    <w:bookmarkStart w:id="53" w:name="procedure-1"/>
     <w:p>
       <w:pPr>
         <w:pStyle w:val="Heading4"/>
@@ -1793,8 +2165,8 @@
         <w:t xml:space="preserve">”</w:t>
       </w:r>
     </w:p>
-    <w:bookmarkEnd w:id="52"/>
-    <w:bookmarkStart w:id="53" w:name="Xc87978686ecc3a843509db04e990c6ef8d55205"/>
+    <w:bookmarkEnd w:id="53"/>
+    <w:bookmarkStart w:id="54" w:name="Xc87978686ecc3a843509db04e990c6ef8d55205"/>
     <w:p>
       <w:pPr>
         <w:pStyle w:val="Heading4"/>
@@ -1811,9 +2183,9 @@
         <w:t xml:space="preserve">Simulate the same model for 1,000 trials with random rolls and plot the four strengths over time. Then make the outcome noisier (reward with probability 0.6 when S1 is active, 0.4 when inactive) and see how many trials it takes for S1 to separate from the others. The brain lives at the noisy end of this spectrum.</w:t>
       </w:r>
     </w:p>
-    <w:bookmarkEnd w:id="53"/>
     <w:bookmarkEnd w:id="54"/>
-    <w:bookmarkStart w:id="58" w:name="X6d2bd130c25debd89a4db7f9a2f2edb3c25db62"/>
+    <w:bookmarkEnd w:id="55"/>
+    <w:bookmarkStart w:id="59" w:name="X6d2bd130c25debd89a4db7f9a2f2edb3c25db62"/>
     <w:p>
       <w:pPr>
         <w:pStyle w:val="Heading3"/>
@@ -1822,7 +2194,7 @@
         <w:t xml:space="preserve">Lab 3.4 - Gated Versus Ungated Plasticity (why activity alone must not cause learning)</w:t>
       </w:r>
     </w:p>
-    <w:bookmarkStart w:id="55" w:name="purpose-3"/>
+    <w:bookmarkStart w:id="56" w:name="purpose-3"/>
     <w:p>
       <w:pPr>
         <w:pStyle w:val="Heading4"/>
@@ -1839,8 +2211,8 @@
         <w:t xml:space="preserve">To make the chapter’s design principle concrete: if synapses changed whenever neurons fired, the system would be unstable.</w:t>
       </w:r>
     </w:p>
-    <w:bookmarkEnd w:id="55"/>
-    <w:bookmarkStart w:id="56" w:name="given-parameters-1"/>
+    <w:bookmarkEnd w:id="56"/>
+    <w:bookmarkStart w:id="57" w:name="given-parameters-1"/>
     <w:p>
       <w:pPr>
         <w:pStyle w:val="Heading4"/>
@@ -1881,8 +2253,8 @@
         <w:t xml:space="preserve">Prediction errors for the 10 trials: 0, 0, 0, +0.5, 0, 0, 0, 0, -0.5, 0.</w:t>
       </w:r>
     </w:p>
-    <w:bookmarkEnd w:id="56"/>
-    <w:bookmarkStart w:id="57" w:name="procedure-2"/>
+    <w:bookmarkEnd w:id="57"/>
+    <w:bookmarkStart w:id="58" w:name="procedure-2"/>
     <w:p>
       <w:pPr>
         <w:pStyle w:val="Heading4"/>
@@ -1972,9 +2344,9 @@
         <w:t xml:space="preserve">?</w:t>
       </w:r>
     </w:p>
-    <w:bookmarkEnd w:id="57"/>
     <w:bookmarkEnd w:id="58"/>
-    <w:bookmarkStart w:id="61" w:name="X6b8f0748ff5b3e1743e8b7046ea0a680bae06e6"/>
+    <w:bookmarkEnd w:id="59"/>
+    <w:bookmarkStart w:id="62" w:name="X6b8f0748ff5b3e1743e8b7046ea0a680bae06e6"/>
     <w:p>
       <w:pPr>
         <w:pStyle w:val="Heading3"/>
@@ -1983,7 +2355,7 @@
         <w:t xml:space="preserve">Lab 3.5 - Neuromodulators as Design Primitives (comparison table and concept map)</w:t>
       </w:r>
     </w:p>
-    <w:bookmarkStart w:id="59" w:name="purpose-4"/>
+    <w:bookmarkStart w:id="60" w:name="purpose-4"/>
     <w:p>
       <w:pPr>
         <w:pStyle w:val="Heading4"/>
@@ -2000,8 +2372,8 @@
         <w:t xml:space="preserve">To integrate the chapter’s four modulatory systems and its argument about artificial intelligence into one explicit comparison.</w:t>
       </w:r>
     </w:p>
-    <w:bookmarkEnd w:id="59"/>
-    <w:bookmarkStart w:id="60" w:name="procedure-3"/>
+    <w:bookmarkEnd w:id="60"/>
+    <w:bookmarkStart w:id="61" w:name="procedure-3"/>
     <w:p>
       <w:pPr>
         <w:pStyle w:val="Heading4"/>
@@ -2027,7 +2399,7 @@
         <w:br/>
       </w:r>
       <w:r>
-        <w:t xml:space="preserve">2) Add six columns: source region (look this up if the chapter does not say), what context it signals, typical timescale, effect on plasticity, effect on ongoing processing, and the nearest artificial-learning analogue (for example: reward prediction error term, exploration temperature, learning-rate schedule, attention weighting).</w:t>
+        <w:t xml:space="preserve">2) Add six columns: source region (from the reference table in the Student Notes), what context it signals, typical timescale, effect on plasticity, effect on ongoing processing, and the nearest artificial-learning analogue (for example: reward prediction error term, exploration temperature, learning-rate schedule, attention weighting).</w:t>
       </w:r>
       <w:r>
         <w:br/>
@@ -2094,10 +2466,10 @@
         <w:t xml:space="preserve">10) In 10-14 sentences, argue for or against adding a neuromodulation-like layer to an artificial agent that must learn in an open-ended environment with delayed, noisy feedback. Address stability, credit assignment, and what you would lose compared with backpropagation. Use at least two of the chapter’s four implications for AI.</w:t>
       </w:r>
     </w:p>
-    <w:bookmarkEnd w:id="60"/>
     <w:bookmarkEnd w:id="61"/>
     <w:bookmarkEnd w:id="62"/>
     <w:bookmarkEnd w:id="63"/>
+    <w:bookmarkEnd w:id="64"/>
     <w:sectPr/>
   </w:body>
 </w:document>

</xml_diff>